<commit_message>
add chunking module and HuggingFace embeddings integration
</commit_message>
<xml_diff>
--- a/test-files/Documento sin título.docx
+++ b/test-files/Documento sin título.docx
@@ -31,7 +31,145 @@
         <w:rPr>
           <w:rtl w:val="0"/>
         </w:rPr>
-        <w:t xml:space="preserve">   Este documento describe las políticas internas de la empresa.</w:t>
+        <w:t xml:space="preserve">Este documento describe las políticas internas de la empresa.</w:t>
+      </w:r>
+    </w:p>
+    <w:p>
+      <w:pPr>
+        <w:rPr/>
+      </w:pPr>
+      <w:r>
+        <w:rPr>
+          <w:rtl w:val="0"/>
+        </w:rPr>
+      </w:r>
+    </w:p>
+    <w:p>
+      <w:pPr>
+        <w:rPr/>
+      </w:pPr>
+      <w:r>
+        <w:rPr>
+          <w:rtl w:val="0"/>
+        </w:rPr>
+        <w:t xml:space="preserve">Política de vacaciones</w:t>
+      </w:r>
+    </w:p>
+    <w:p>
+      <w:pPr>
+        <w:rPr/>
+      </w:pPr>
+      <w:r>
+        <w:rPr>
+          <w:rtl w:val="0"/>
+        </w:rPr>
+        <w:t xml:space="preserve">Todos los colaboradores tienen derecho a catorce días corridos de descanso anual, acumulables desde el primer día de ingreso a la organización. Las vacaciones deben solicitarse con al menos dos semanas de anticipación a través del sistema interno de RRHH.</w:t>
+      </w:r>
+    </w:p>
+    <w:p>
+      <w:pPr>
+        <w:rPr/>
+      </w:pPr>
+      <w:r>
+        <w:rPr>
+          <w:rtl w:val="0"/>
+        </w:rPr>
+      </w:r>
+    </w:p>
+    <w:p>
+      <w:pPr>
+        <w:rPr/>
+      </w:pPr>
+      <w:r>
+        <w:rPr>
+          <w:rtl w:val="0"/>
+        </w:rPr>
+        <w:t xml:space="preserve">Política de licencias médicas</w:t>
+      </w:r>
+    </w:p>
+    <w:p>
+      <w:pPr>
+        <w:rPr/>
+      </w:pPr>
+      <w:r>
+        <w:rPr>
+          <w:rtl w:val="0"/>
+        </w:rPr>
+        <w:t xml:space="preserve">Los colaboradores que necesiten ausentarse por motivos de salud deben notificar a su supervisor directo dentro de las primeras dos horas de la jornada laboral. Se requiere certificado médico para ausencias mayores a dos días consecutivos.</w:t>
+      </w:r>
+    </w:p>
+    <w:p>
+      <w:pPr>
+        <w:rPr/>
+      </w:pPr>
+      <w:r>
+        <w:rPr>
+          <w:rtl w:val="0"/>
+        </w:rPr>
+      </w:r>
+    </w:p>
+    <w:p>
+      <w:pPr>
+        <w:rPr/>
+      </w:pPr>
+      <w:r>
+        <w:rPr>
+          <w:rtl w:val="0"/>
+        </w:rPr>
+        <w:t xml:space="preserve">Política de teletrabajo</w:t>
+      </w:r>
+    </w:p>
+    <w:p>
+      <w:pPr>
+        <w:rPr/>
+      </w:pPr>
+      <w:r>
+        <w:rPr>
+          <w:rtl w:val="0"/>
+        </w:rPr>
+        <w:t xml:space="preserve">La empresa permite modalidad híbrida para todos los puestos que no requieran presencia física constante. Los colaboradores deben coordinar con su equipo al menos tres días de presencialidad por semana.</w:t>
+      </w:r>
+    </w:p>
+    <w:p>
+      <w:pPr>
+        <w:rPr/>
+      </w:pPr>
+      <w:r>
+        <w:rPr>
+          <w:rtl w:val="0"/>
+        </w:rPr>
+      </w:r>
+    </w:p>
+    <w:p>
+      <w:pPr>
+        <w:rPr/>
+      </w:pPr>
+      <w:r>
+        <w:rPr>
+          <w:rtl w:val="0"/>
+        </w:rPr>
+        <w:t xml:space="preserve">Política de gastos y reembolsos</w:t>
+      </w:r>
+    </w:p>
+    <w:p>
+      <w:pPr>
+        <w:rPr/>
+      </w:pPr>
+      <w:r>
+        <w:rPr>
+          <w:rtl w:val="0"/>
+        </w:rPr>
+        <w:t xml:space="preserve">Todo gasto realizado en representación de la empresa debe ser reportado dentro de los cinco días hábiles posteriores a su realización, adjuntando el comprobante correspondiente.</w:t>
+      </w:r>
+    </w:p>
+    <w:p>
+      <w:pPr>
+        <w:rPr/>
+      </w:pPr>
+      <w:r>
+        <w:rPr>
+          <w:rtl w:val="0"/>
+        </w:rPr>
       </w:r>
     </w:p>
     <w:p>

</xml_diff>